<commit_message>
Replace rulebook Action card figure with annotated diagram
</commit_message>
<xml_diff>
--- a/rulebook/en/dangers-and-dwellers-short.docx
+++ b/rulebook/en/dangers-and-dwellers-short.docx
@@ -1881,8 +1881,8 @@
       <w:r>
         <w:drawing>
           <wp:inline xmlns:a="http://schemas.openxmlformats.org/drawingml/2006/main" xmlns:pic="http://schemas.openxmlformats.org/drawingml/2006/picture">
-            <wp:extent cx="1692000" cy="2389495"/>
-            <wp:docPr id="11" name="Picture 11" descr="research"/>
+            <wp:extent cx="6192000" cy="3649263"/>
+            <wp:docPr id="11" name="Picture 11" descr="action card annotated"/>
             <wp:cNvGraphicFramePr>
               <a:graphicFrameLocks noChangeAspect="1"/>
             </wp:cNvGraphicFramePr>
@@ -1890,7 +1890,7 @@
               <a:graphicData uri="http://schemas.openxmlformats.org/drawingml/2006/picture">
                 <pic:pic>
                   <pic:nvPicPr>
-                    <pic:cNvPr id="0" name="research.png"/>
+                    <pic:cNvPr id="0" name="action-card-annotated.png"/>
                     <pic:cNvPicPr/>
                   </pic:nvPicPr>
                   <pic:blipFill>
@@ -1902,7 +1902,7 @@
                   <pic:spPr>
                     <a:xfrm>
                       <a:off x="0" y="0"/>
-                      <a:ext cx="1692000" cy="2389495"/>
+                      <a:ext cx="6192000" cy="3649263"/>
                     </a:xfrm>
                     <a:prstGeom prst="rect"/>
                   </pic:spPr>
@@ -1920,7 +1920,7 @@
       </w:pPr>
       <w:r>
         <w:rPr/>
-        <w:t>Cost and implementation time appear at the top of each Action card.</w:t>
+        <w:t>The fields of an Action card, illustrated by Urban Redevelopment.</w:t>
       </w:r>
     </w:p>
     <w:p>

</xml_diff>